<commit_message>
feat(payment): integrate DOKU Production QRIS for Non-IPL incomes and extract shared QrisCheckoutModal
</commit_message>
<xml_diff>
--- a/docs/production/User Manual- Warga/Panduan_Penggunaan_Portal_Warga_Palm_Village.docx
+++ b/docs/production/User Manual- Warga/Panduan_Penggunaan_Portal_Warga_Palm_Village.docx
@@ -158,7 +158,25 @@
                 <w:color w:val="283C32"/>
                 <w:sz w:val="19"/>
               </w:rPr>
-              <w:t>1. Masuk pakai Google  ➜  2. Cari baris 'RUMAH SAYA' &amp; centang bulan  ➜  3. Scan QRIS di GoPay / BCA / Shopee / Livin  ➜  4. Langsung Lunas Otomatis!</w:t>
+              <w:t xml:space="preserve">1. Masuk pakai </w:t>
+            </w:r>
+            <w:proofErr w:type="gramStart"/>
+            <w:r>
+              <w:rPr>
+                <w:rFonts w:ascii="Segoe UI" w:hAnsi="Segoe UI"/>
+                <w:color w:val="283C32"/>
+                <w:sz w:val="19"/>
+              </w:rPr>
+              <w:t>Google  ➜</w:t>
+            </w:r>
+            <w:proofErr w:type="gramEnd"/>
+            <w:r>
+              <w:rPr>
+                <w:rFonts w:ascii="Segoe UI" w:hAnsi="Segoe UI"/>
+                <w:color w:val="283C32"/>
+                <w:sz w:val="19"/>
+              </w:rPr>
+              <w:t xml:space="preserve">  2. Cari baris 'RUMAH SAYA' &amp; centang bulan  ➜  3. Scan QRIS di GoPay / BCA / Shopee / Livin  ➜  4. Langsung Lunas Otomatis!</w:t>
             </w:r>
           </w:p>
         </w:tc>
@@ -1717,14 +1735,11 @@
               <w:jc w:val="center"/>
             </w:pPr>
             <w:r>
-              <w:rPr>
-                <w:noProof/>
-              </w:rPr>
               <w:drawing>
-                <wp:inline distT="0" distB="0" distL="0" distR="0" wp14:anchorId="18456278" wp14:editId="38DF5210">
-                  <wp:extent cx="1767840" cy="3941628"/>
+                <wp:inline distT="0" distB="0" distL="0" distR="0" wp14:anchorId="40D5C1B5" wp14:editId="263FE868">
+                  <wp:extent cx="2001520" cy="4344035"/>
                   <wp:effectExtent l="0" t="0" r="0" b="0"/>
-                  <wp:docPr id="12" name="Picture 12"/>
+                  <wp:docPr id="286804310" name="Picture 1"/>
                   <wp:cNvGraphicFramePr>
                     <a:graphicFrameLocks xmlns:a="http://schemas.openxmlformats.org/drawingml/2006/main" noChangeAspect="1"/>
                   </wp:cNvGraphicFramePr>
@@ -1732,7 +1747,7 @@
                     <a:graphicData uri="http://schemas.openxmlformats.org/drawingml/2006/picture">
                       <pic:pic xmlns:pic="http://schemas.openxmlformats.org/drawingml/2006/picture">
                         <pic:nvPicPr>
-                          <pic:cNvPr id="0" name="12-notifikasi-qris-ditutup.jpg"/>
+                          <pic:cNvPr id="286804310" name=""/>
                           <pic:cNvPicPr/>
                         </pic:nvPicPr>
                         <pic:blipFill>
@@ -1744,7 +1759,7 @@
                         <pic:spPr>
                           <a:xfrm>
                             <a:off x="0" y="0"/>
-                            <a:ext cx="1767840" cy="3941628"/>
+                            <a:ext cx="2001520" cy="4344035"/>
                           </a:xfrm>
                           <a:prstGeom prst="rect">
                             <a:avLst/>
@@ -1779,6 +1794,91 @@
       <w:pPr>
         <w:spacing w:after="120"/>
       </w:pPr>
+      <w:r>
+        <w:rPr>
+          <w:noProof/>
+        </w:rPr>
+        <mc:AlternateContent>
+          <mc:Choice Requires="wps">
+            <w:drawing>
+              <wp:anchor distT="0" distB="0" distL="114300" distR="114300" simplePos="0" relativeHeight="251664384" behindDoc="0" locked="0" layoutInCell="1" allowOverlap="1" wp14:anchorId="45F61BD3" wp14:editId="4F0991F2">
+                <wp:simplePos x="0" y="0"/>
+                <wp:positionH relativeFrom="column">
+                  <wp:posOffset>6002454</wp:posOffset>
+                </wp:positionH>
+                <wp:positionV relativeFrom="paragraph">
+                  <wp:posOffset>-2534243</wp:posOffset>
+                </wp:positionV>
+                <wp:extent cx="511370" cy="407363"/>
+                <wp:effectExtent l="57150" t="19050" r="79375" b="88265"/>
+                <wp:wrapNone/>
+                <wp:docPr id="177132483" name="Arrow: Left 2"/>
+                <wp:cNvGraphicFramePr/>
+                <a:graphic xmlns:a="http://schemas.openxmlformats.org/drawingml/2006/main">
+                  <a:graphicData uri="http://schemas.microsoft.com/office/word/2010/wordprocessingShape">
+                    <wps:wsp>
+                      <wps:cNvSpPr/>
+                      <wps:spPr>
+                        <a:xfrm>
+                          <a:off x="0" y="0"/>
+                          <a:ext cx="511370" cy="407363"/>
+                        </a:xfrm>
+                        <a:prstGeom prst="leftArrow">
+                          <a:avLst/>
+                        </a:prstGeom>
+                      </wps:spPr>
+                      <wps:style>
+                        <a:lnRef idx="1">
+                          <a:schemeClr val="accent6"/>
+                        </a:lnRef>
+                        <a:fillRef idx="3">
+                          <a:schemeClr val="accent6"/>
+                        </a:fillRef>
+                        <a:effectRef idx="2">
+                          <a:schemeClr val="accent6"/>
+                        </a:effectRef>
+                        <a:fontRef idx="minor">
+                          <a:schemeClr val="lt1"/>
+                        </a:fontRef>
+                      </wps:style>
+                      <wps:bodyPr rot="0" spcFirstLastPara="0" vertOverflow="overflow" horzOverflow="overflow" vert="horz" wrap="square" lIns="91440" tIns="45720" rIns="91440" bIns="45720" numCol="1" spcCol="0" rtlCol="0" fromWordArt="0" anchor="ctr" anchorCtr="0" forceAA="0" compatLnSpc="1">
+                        <a:prstTxWarp prst="textNoShape">
+                          <a:avLst/>
+                        </a:prstTxWarp>
+                        <a:noAutofit/>
+                      </wps:bodyPr>
+                    </wps:wsp>
+                  </a:graphicData>
+                </a:graphic>
+              </wp:anchor>
+            </w:drawing>
+          </mc:Choice>
+          <mc:Fallback>
+            <w:pict>
+              <v:shapetype w14:anchorId="15DD385C" id="_x0000_t66" coordsize="21600,21600" o:spt="66" adj="5400,5400" path="m@0,l@0@1,21600@1,21600@2@0@2@0,21600,,10800xe">
+                <v:stroke joinstyle="miter"/>
+                <v:formulas>
+                  <v:f eqn="val #0"/>
+                  <v:f eqn="val #1"/>
+                  <v:f eqn="sum 21600 0 #1"/>
+                  <v:f eqn="prod #0 #1 10800"/>
+                  <v:f eqn="sum #0 0 @3"/>
+                </v:formulas>
+                <v:path o:connecttype="custom" o:connectlocs="@0,0;0,10800;@0,21600;21600,10800" o:connectangles="270,180,90,0" textboxrect="@4,@1,21600,@2"/>
+                <v:handles>
+                  <v:h position="#0,#1" xrange="0,21600" yrange="0,10800"/>
+                </v:handles>
+              </v:shapetype>
+              <v:shape id="Arrow: Left 2" o:spid="_x0000_s1026" type="#_x0000_t66" style="position:absolute;margin-left:472.65pt;margin-top:-199.55pt;width:40.25pt;height:32.1pt;z-index:251664384;visibility:visible;mso-wrap-style:square;mso-wrap-distance-left:9pt;mso-wrap-distance-top:0;mso-wrap-distance-right:9pt;mso-wrap-distance-bottom:0;mso-position-horizontal:absolute;mso-position-horizontal-relative:text;mso-position-vertical:absolute;mso-position-vertical-relative:text;v-text-anchor:middle" o:gfxdata="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" adj="8603" fillcolor="#f79646 [3209]" strokecolor="#f68c36 [3049]">
+                <v:fill color2="#fbcaa2 [1625]" rotate="t" angle="180" focus="100%" type="gradient">
+                  <o:fill v:ext="view" type="gradientUnscaled"/>
+                </v:fill>
+                <v:shadow on="t" color="black" opacity="22937f" origin=",.5" offset="0,.63889mm"/>
+              </v:shape>
+            </w:pict>
+          </mc:Fallback>
+        </mc:AlternateContent>
+      </w:r>
     </w:p>
     <w:tbl>
       <w:tblPr>
@@ -1966,7 +2066,25 @@
           <w:color w:val="3C4B44"/>
           <w:sz w:val="19"/>
         </w:rPr>
-        <w:t>Jika memilih transfer manual ke rekening bank pengurus, silakan transfer terlebih dahulu, lalu pilih tab 'Transfer Bank' pada pop-up. Klik 'Choose File' untuk mengunggah foto bukti transfer dari galeri HP (maks 2MB), tambahkan catatan nama pengirim, lalu klik tombol kuning 'Kirim Bukti Transfer'.</w:t>
+        <w:t xml:space="preserve">Jika </w:t>
+      </w:r>
+      <w:proofErr w:type="spellStart"/>
+      <w:r>
+        <w:rPr>
+          <w:rFonts w:ascii="Segoe UI" w:hAnsi="Segoe UI"/>
+          <w:color w:val="3C4B44"/>
+          <w:sz w:val="19"/>
+        </w:rPr>
+        <w:t>memilih</w:t>
+      </w:r>
+      <w:proofErr w:type="spellEnd"/>
+      <w:r>
+        <w:rPr>
+          <w:rFonts w:ascii="Segoe UI" w:hAnsi="Segoe UI"/>
+          <w:color w:val="3C4B44"/>
+          <w:sz w:val="19"/>
+        </w:rPr>
+        <w:t xml:space="preserve"> transfer manual ke rekening bank pengurus, silakan transfer terlebih dahulu, lalu pilih tab 'Transfer Bank' pada pop-up. Klik 'Choose File' untuk mengunggah foto bukti transfer dari galeri HP (maks 2MB), tambahkan catatan nama pengirim, lalu klik tombol kuning 'Kirim Bukti Transfer'.</w:t>
       </w:r>
     </w:p>
     <w:tbl>
@@ -2449,6 +2567,7 @@
             </w:tcMar>
           </w:tcPr>
           <w:p>
+            <w:proofErr w:type="spellStart"/>
             <w:r>
               <w:rPr>
                 <w:rFonts w:ascii="Segoe UI" w:hAnsi="Segoe UI"/>
@@ -2456,7 +2575,17 @@
                 <w:color w:val="FFFFFF"/>
                 <w:sz w:val="19"/>
               </w:rPr>
-              <w:t>Keterangan Lengkap untuk Warga</w:t>
+              <w:t>Keterangan</w:t>
+            </w:r>
+            <w:proofErr w:type="spellEnd"/>
+            <w:r>
+              <w:rPr>
+                <w:rFonts w:ascii="Segoe UI" w:hAnsi="Segoe UI"/>
+                <w:b/>
+                <w:color w:val="FFFFFF"/>
+                <w:sz w:val="19"/>
+              </w:rPr>
+              <w:t xml:space="preserve"> Lengkap untuk Warga</w:t>
             </w:r>
           </w:p>
         </w:tc>
@@ -3006,50 +3135,7 @@
               <w:right w:w="100" w:type="dxa"/>
             </w:tcMar>
           </w:tcPr>
-          <w:p>
-            <w:r>
-              <w:rPr>
-                <w:rFonts w:ascii="Segoe UI" w:hAnsi="Segoe UI"/>
-                <w:color w:val="14281E"/>
-                <w:sz w:val="18"/>
-              </w:rPr>
-              <w:drawing>
-                <wp:inline distT="0" distB="0" distL="0" distR="0" wp14:anchorId="28A42C70" wp14:editId="64E963CD">
-                  <wp:extent cx="1200150" cy="257660"/>
-                  <wp:effectExtent l="0" t="0" r="0" b="9525"/>
-                  <wp:docPr id="580352320" name="Picture 1"/>
-                  <wp:cNvGraphicFramePr>
-                    <a:graphicFrameLocks xmlns:a="http://schemas.openxmlformats.org/drawingml/2006/main" noChangeAspect="1"/>
-                  </wp:cNvGraphicFramePr>
-                  <a:graphic xmlns:a="http://schemas.openxmlformats.org/drawingml/2006/main">
-                    <a:graphicData uri="http://schemas.openxmlformats.org/drawingml/2006/picture">
-                      <pic:pic xmlns:pic="http://schemas.openxmlformats.org/drawingml/2006/picture">
-                        <pic:nvPicPr>
-                          <pic:cNvPr id="580352320" name=""/>
-                          <pic:cNvPicPr/>
-                        </pic:nvPicPr>
-                        <pic:blipFill>
-                          <a:blip r:embed="rId26"/>
-                          <a:stretch>
-                            <a:fillRect/>
-                          </a:stretch>
-                        </pic:blipFill>
-                        <pic:spPr>
-                          <a:xfrm>
-                            <a:off x="0" y="0"/>
-                            <a:ext cx="1217841" cy="261458"/>
-                          </a:xfrm>
-                          <a:prstGeom prst="rect">
-                            <a:avLst/>
-                          </a:prstGeom>
-                        </pic:spPr>
-                      </pic:pic>
-                    </a:graphicData>
-                  </a:graphic>
-                </wp:inline>
-              </w:drawing>
-            </w:r>
-          </w:p>
+          <w:p/>
         </w:tc>
         <w:tc>
           <w:tcPr>

</xml_diff>